<commit_message>
docs/data: update Chapter 6 json/docx with manual corrections
</commit_message>
<xml_diff>
--- a/第六章/第六章.docx
+++ b/第六章/第六章.docx
@@ -598,7 +598,7 @@
     <w:p>
       <w:pPr>
         <w:pStyle w:val="a9"/>
-        <w:ind w:left="960" w:hanging="960"/>
+        <w:ind w:left="720" w:hanging="720"/>
         <w:jc w:val="both"/>
       </w:pPr>
       <w:r>
@@ -608,21 +608,6 @@
           <w:sz w:val="24"/>
         </w:rPr>
         <w:t>備註：1. 「押標金保證金暨其他擔保作業辦法」於九十一年三月二十六日(九一)工程企字第九一〇一一七五四號令修正，本函說明五「第三十條規定『自機關通知之日起五日內』」已修正為「第三十條第二項規定『應訂定五日以上之合理期限』」。</w:t>
-      </w:r>
-    </w:p>
-    <w:p>
-      <w:pPr>
-        <w:pStyle w:val="a9"/>
-        <w:ind w:left="960" w:hanging="240"/>
-        <w:jc w:val="both"/>
-      </w:pPr>
-      <w:r>
-        <w:rPr>
-          <w:rFonts w:ascii="新細明體" w:hAnsi="新細明體" w:eastAsia="新細明體"/>
-          <w:b w:val="0"/>
-          <w:sz w:val="24"/>
-        </w:rPr>
-        <w:t>2. 「押標金保證金暨其他擔保作業辦法」於九十一年三月二十六日(九一)工程企字第九一○一一七五四號令修正，本函說明五「第三十條規定『自機關通知之日起五日內』」已修正為「第三十條第二項規定『應訂定五日以上之合理期限』」。</w:t>
       </w:r>
     </w:p>
     <w:p/>
@@ -1334,22 +1319,7 @@
           <w:b w:val="0"/>
           <w:sz w:val="24"/>
         </w:rPr>
-        <w:t>（一）決標原則：本法第52條第1項第1款規定：「機關辦理採購之決標，應依下列原則之一辦理，並應載明於招標文件中：</w:t>
-      </w:r>
-    </w:p>
-    <w:p>
-      <w:pPr>
-        <w:pStyle w:val="a9"/>
-        <w:ind w:left="720" w:hanging="480"/>
-        <w:jc w:val="both"/>
-      </w:pPr>
-      <w:r>
-        <w:rPr>
-          <w:rFonts w:ascii="新細明體" w:hAnsi="新細明體" w:eastAsia="新細明體"/>
-          <w:b w:val="0"/>
-          <w:sz w:val="24"/>
-        </w:rPr>
-        <w:t>一、訂有底價之採購，以合於招標文件規定，且在底價以內之最低標為得標廠商。」；其施行細則第69條規定：「機關辦理減價或比減價格結果在底價以內時，除有本法第58條總標價或部分標價偏低之情形者外，應即宣布決標。」</w:t>
+        <w:t>（一）決標原則：本法第52條第1項第1款規定：「機關辦理採購之決標，應依下列原則之一辦理，並應載明於招標文件中：一、訂有底價之採購，以合於招標文件規定，且在底價以內之最低標為得標廠商。」；其施行細則第69條規定：「機關辦理減價或比減價格結果在底價以內時，除有本法第58條總標價或部分標價偏低之情形者外，應即宣布決標。」</w:t>
       </w:r>
     </w:p>
     <w:p>
@@ -1379,112 +1349,7 @@
           <w:b w:val="0"/>
           <w:sz w:val="24"/>
         </w:rPr>
-        <w:t>（三）標價不合理之處置：本法第58條規定：「機關辦理採購採最低標決標時，如認為最低標廠商之總標價或部分標價偏低，顯不合理，有降低品質、不能誠信履約之虞或其他特殊情形，得限期通知該廠商提出說明或擔保。廠商未於機關通知期限內提出合理之說明或擔保者，得不決標予該廠商，並以次低標廠商為最低標廠商」；其施行細則第79條規定：「本法第58條所稱總標價偏低，指下列情形之一：</w:t>
-      </w:r>
-    </w:p>
-    <w:p>
-      <w:pPr>
-        <w:pStyle w:val="a9"/>
-        <w:ind w:left="720" w:hanging="480"/>
-        <w:jc w:val="both"/>
-      </w:pPr>
-      <w:r>
-        <w:rPr>
-          <w:rFonts w:ascii="新細明體" w:hAnsi="新細明體" w:eastAsia="新細明體"/>
-          <w:b w:val="0"/>
-          <w:sz w:val="24"/>
-        </w:rPr>
-        <w:t>一、訂有底價之採購，廠商之總標價低於底價百分之八十者。</w:t>
-      </w:r>
-    </w:p>
-    <w:p>
-      <w:pPr>
-        <w:pStyle w:val="a9"/>
-        <w:ind w:left="720" w:hanging="480"/>
-        <w:jc w:val="both"/>
-      </w:pPr>
-      <w:r>
-        <w:rPr>
-          <w:rFonts w:ascii="新細明體" w:hAnsi="新細明體" w:eastAsia="新細明體"/>
-          <w:b w:val="0"/>
-          <w:sz w:val="24"/>
-        </w:rPr>
-        <w:t>二、未訂底價之採購，廠商之總標價經評審或評選委員會認為偏低者。</w:t>
-      </w:r>
-    </w:p>
-    <w:p>
-      <w:pPr>
-        <w:pStyle w:val="a9"/>
-        <w:ind w:left="720" w:hanging="480"/>
-        <w:jc w:val="both"/>
-      </w:pPr>
-      <w:r>
-        <w:rPr>
-          <w:rFonts w:ascii="新細明體" w:hAnsi="新細明體" w:eastAsia="新細明體"/>
-          <w:b w:val="0"/>
-          <w:sz w:val="24"/>
-        </w:rPr>
-        <w:t>三、未訂底價且未設置評審委員會或評選委員會之採購，廠商之總標價低於預算金額或預估需用金額之百分之七十者。預算案尚未經立法程序者，以預估需用金額計算之」；第80條規定：「本法第58條所稱部分標價偏低，指下列情形之一：</w:t>
-      </w:r>
-    </w:p>
-    <w:p>
-      <w:pPr>
-        <w:pStyle w:val="a9"/>
-        <w:ind w:left="720" w:hanging="480"/>
-        <w:jc w:val="both"/>
-      </w:pPr>
-      <w:r>
-        <w:rPr>
-          <w:rFonts w:ascii="新細明體" w:hAnsi="新細明體" w:eastAsia="新細明體"/>
-          <w:b w:val="0"/>
-          <w:sz w:val="24"/>
-        </w:rPr>
-        <w:t>一、該部分標價有對應之底價項目可供比較，該部分標價低於相同部分項目底價之百分之七十者。</w:t>
-      </w:r>
-    </w:p>
-    <w:p>
-      <w:pPr>
-        <w:pStyle w:val="a9"/>
-        <w:ind w:left="720" w:hanging="480"/>
-        <w:jc w:val="both"/>
-      </w:pPr>
-      <w:r>
-        <w:rPr>
-          <w:rFonts w:ascii="新細明體" w:hAnsi="新細明體" w:eastAsia="新細明體"/>
-          <w:b w:val="0"/>
-          <w:sz w:val="24"/>
-        </w:rPr>
-        <w:t>二、廠商之部分標價經評審或評選委員會認為偏低者。</w:t>
-      </w:r>
-    </w:p>
-    <w:p>
-      <w:pPr>
-        <w:pStyle w:val="a9"/>
-        <w:ind w:left="720" w:hanging="480"/>
-        <w:jc w:val="both"/>
-      </w:pPr>
-      <w:r>
-        <w:rPr>
-          <w:rFonts w:ascii="新細明體" w:hAnsi="新細明體" w:eastAsia="新細明體"/>
-          <w:b w:val="0"/>
-          <w:sz w:val="24"/>
-        </w:rPr>
-        <w:t>三、廠商之部分標價低於其他機關最近辦理相同採購決標價之百分之七十者。</w:t>
-      </w:r>
-    </w:p>
-    <w:p>
-      <w:pPr>
-        <w:pStyle w:val="a9"/>
-        <w:ind w:left="720" w:hanging="480"/>
-        <w:jc w:val="both"/>
-      </w:pPr>
-      <w:r>
-        <w:rPr>
-          <w:rFonts w:ascii="新細明體" w:hAnsi="新細明體" w:eastAsia="新細明體"/>
-          <w:b w:val="0"/>
-          <w:sz w:val="24"/>
-        </w:rPr>
-        <w:t>四、廠商之部分標價低於可供參考之一般價格之百分之七十者」，本會並訂有「依政府採購法第58條處理總標價低於底價百分之八十案件之執行程序」。</w:t>
+        <w:t>（三）標價不合理之處置：本法第58條規定：「機關辦理採購採最低標決標時，如認為最低標廠商之總標價或部分標價偏低，顯不合理，有降低品質、不能誠信履約之虞或其他特殊情形，得限期通知該廠商提出說明或擔保。廠商未於機關通知期限內提出合理之說明或擔保者，得不決標予該廠商，並以次低標廠商為最低標廠商」；其施行細則第79條規定：「本法第58條所稱總標價偏低，指下列情形之一：一、訂有底價之採購，廠商之總標價低於底價百分之八十者。二、未訂底價之採購，廠商之總標價經評審或評選委員會認為偏低者。三、未訂底價且未設置評審委員會或評選委員會之採購，廠商之總標價低於預算金額或預估需用金額之百分之七十者。預算案尚未經立法程序者，以預估需用金額計算之」；第80條規定：「本法第58條所稱部分標價偏低，指下列情形之一：一、該部分標價有對應之底價項目可供比較，該部分標價低於相同部分項目底價之百分之七十者。二、廠商之部分標價經評審或評選委員會認為偏低者。三、廠商之部分標價低於其他機關最近辦理相同採購決標價之百分之七十者。四、廠商之部分標價低於可供參考之一般價格之百分之七十者」，本會並訂有「依政府採購法第58條處理總標價低於底價百分之八十案件之執行程序」。</w:t>
       </w:r>
     </w:p>
     <w:p>
@@ -1529,7 +1394,7 @@
           <w:b w:val="0"/>
           <w:sz w:val="24"/>
         </w:rPr>
-        <w:t>（二）契約價金之給付：「採購契約要項」第31點載明：「契約價金之給付，得為下列方式之一，由機關載明於契約：</w:t>
+        <w:t>（二）契約價金之給付：「採購契約要項」第31點載明：「契約價金之給付，得為下列方式之一，由機關載明於契約：(一)依契約總價給付。(二)依實際施作或供應之項目及數量給付。(三)部分依契約標示之價金給付，部分依實際施作或供應之項目及數量給付。(四)其他必要之方式。」</w:t>
       </w:r>
     </w:p>
     <w:p>
@@ -1544,112 +1409,7 @@
           <w:b w:val="0"/>
           <w:sz w:val="24"/>
         </w:rPr>
-        <w:t>（一）依契約總價給付。</w:t>
-      </w:r>
-    </w:p>
-    <w:p>
-      <w:pPr>
-        <w:pStyle w:val="a9"/>
-        <w:ind w:left="964" w:hanging="680"/>
-        <w:jc w:val="both"/>
-      </w:pPr>
-      <w:r>
-        <w:rPr>
-          <w:rFonts w:ascii="新細明體" w:hAnsi="新細明體" w:eastAsia="新細明體"/>
-          <w:b w:val="0"/>
-          <w:sz w:val="24"/>
-        </w:rPr>
-        <w:t>（二）依實際施作或供應之項目及數量給付。</w:t>
-      </w:r>
-    </w:p>
-    <w:p>
-      <w:pPr>
-        <w:pStyle w:val="a9"/>
-        <w:ind w:left="964" w:hanging="680"/>
-        <w:jc w:val="both"/>
-      </w:pPr>
-      <w:r>
-        <w:rPr>
-          <w:rFonts w:ascii="新細明體" w:hAnsi="新細明體" w:eastAsia="新細明體"/>
-          <w:b w:val="0"/>
-          <w:sz w:val="24"/>
-        </w:rPr>
-        <w:t>（三）部分依契約標示之價金給付，部分依實際施作或供應之項目及數量給付。</w:t>
-      </w:r>
-    </w:p>
-    <w:p>
-      <w:pPr>
-        <w:pStyle w:val="a9"/>
-        <w:ind w:left="964" w:hanging="680"/>
-        <w:jc w:val="both"/>
-      </w:pPr>
-      <w:r>
-        <w:rPr>
-          <w:rFonts w:ascii="新細明體" w:hAnsi="新細明體" w:eastAsia="新細明體"/>
-          <w:b w:val="0"/>
-          <w:sz w:val="24"/>
-        </w:rPr>
-        <w:t>（四）其他必要之方式。」</w:t>
-      </w:r>
-    </w:p>
-    <w:p>
-      <w:pPr>
-        <w:pStyle w:val="a9"/>
-        <w:ind w:left="964" w:hanging="680"/>
-        <w:jc w:val="both"/>
-      </w:pPr>
-      <w:r>
-        <w:rPr>
-          <w:rFonts w:ascii="新細明體" w:hAnsi="新細明體" w:eastAsia="新細明體"/>
-          <w:b w:val="0"/>
-          <w:sz w:val="24"/>
-        </w:rPr>
-        <w:t>（三）契約約定以總價決標、總價給付者，契約價金之調整：上開要項第32點載明：「契約價金係以總價決標，且以契約總價給付，而其履約有下列情形之一者，得調整之。但契約另有規定者，不在此限。</w:t>
-      </w:r>
-    </w:p>
-    <w:p>
-      <w:pPr>
-        <w:pStyle w:val="a9"/>
-        <w:ind w:left="964" w:hanging="680"/>
-        <w:jc w:val="both"/>
-      </w:pPr>
-      <w:r>
-        <w:rPr>
-          <w:rFonts w:ascii="新細明體" w:hAnsi="新細明體" w:eastAsia="新細明體"/>
-          <w:b w:val="0"/>
-          <w:sz w:val="24"/>
-        </w:rPr>
-        <w:t>（一）因契約變更致增減履約項目或數量時，就變更之部分加減賬結算。</w:t>
-      </w:r>
-    </w:p>
-    <w:p>
-      <w:pPr>
-        <w:pStyle w:val="a9"/>
-        <w:ind w:left="964" w:hanging="680"/>
-        <w:jc w:val="both"/>
-      </w:pPr>
-      <w:r>
-        <w:rPr>
-          <w:rFonts w:ascii="新細明體" w:hAnsi="新細明體" w:eastAsia="新細明體"/>
-          <w:b w:val="0"/>
-          <w:sz w:val="24"/>
-        </w:rPr>
-        <w:t>（二）工程之個別項目實作數量較契約所定數量增減達百分之五以上者，其逾百分之五之部分，變更設計增減契約價金。未達百分之五者，契約價金得不予增減。</w:t>
-      </w:r>
-    </w:p>
-    <w:p>
-      <w:pPr>
-        <w:pStyle w:val="a9"/>
-        <w:ind w:left="964" w:hanging="680"/>
-        <w:jc w:val="both"/>
-      </w:pPr>
-      <w:r>
-        <w:rPr>
-          <w:rFonts w:ascii="新細明體" w:hAnsi="新細明體" w:eastAsia="新細明體"/>
-          <w:b w:val="0"/>
-          <w:sz w:val="24"/>
-        </w:rPr>
-        <w:t>（三）與前二款有關之稅捐、利潤或管理費等相關項目另列一式計價者，依結算金額與原契約金額之比率增減之。」</w:t>
+        <w:t>（三）契約約定以總價決標、總價給付者，契約價金之調整：上開要項第32點載明：「契約價金係以總價決標，且以契約總價給付，而其履約有下列情形之一者，得調整之。但契約另有規定者，不在此限。(一)因契約變更致增減履約項目或數量時，就變更之部分加減賬結算。(二)工程之個別項目實作數量較契約所定數量增減達百分之五以上者，其逾百分之五之部分，變更設計增減契約價金。未達百分之五者，契約價金得不予增減。(三)與前二款有關之稅捐、利潤或管理費等相關項目另列一式計價者，依結算金額與原契約金額之比率增減之。」</w:t>
       </w:r>
     </w:p>
     <w:p/>
@@ -1863,7 +1623,22 @@
           <w:b w:val="0"/>
           <w:sz w:val="24"/>
         </w:rPr>
-        <w:t>一、貴處八十八年十一月五日嘉市(財)字第〇〇二號函收悉。二、有關未得標廠商之投標文件，廠商要求發還投標文件者，機關得保留其中一份，其餘發還，或僅保留影本。</w:t>
+        <w:t>一、貴處八十八年十一月五日嘉市(財)字第〇〇二號函收悉。</w:t>
+      </w:r>
+    </w:p>
+    <w:p>
+      <w:pPr>
+        <w:pStyle w:val="a9"/>
+        <w:ind w:left="720" w:hanging="480"/>
+        <w:jc w:val="both"/>
+      </w:pPr>
+      <w:r>
+        <w:rPr>
+          <w:rFonts w:ascii="新細明體" w:hAnsi="新細明體" w:eastAsia="新細明體"/>
+          <w:b w:val="0"/>
+          <w:sz w:val="24"/>
+        </w:rPr>
+        <w:t>二、有關未得標廠商之投標文件，廠商要求發還投標文件者，機關得保留其中一份，其餘發還，或僅保留影本。</w:t>
       </w:r>
     </w:p>
     <w:p/>
@@ -2092,7 +1867,7 @@
           <w:b w:val="0"/>
           <w:sz w:val="24"/>
         </w:rPr>
-        <w:t>主旨：檢送&lt;a href="/gpletf/異質最低標須知-950523發文確定版.doc" target="_blank"「機關異質採購最低標作業須知」&lt;/a、&lt;a href="/gpletf/異質最有利標-950523發文確定版.doc" target="_blank"「機關異質採購最有利標作業須知」&lt;/a及&lt;a href="/gpletf/異質採購-政府採購決標方式一覽表-0523發文確定版.doc" target="_blank"「政府採購決標方式一覽表」&lt;/a，請查照並轉知所屬（轄）機關。</w:t>
+        <w:t>主旨：檢送「機關異質採購最低標作業須知」、「機關異質採購最有利標作業須知」及「政府採購決標方式一覽表」，請查照並轉知所屬（轄）機關。</w:t>
       </w:r>
     </w:p>
     <w:p>
@@ -2158,16 +1933,31 @@
     <w:p>
       <w:pPr>
         <w:pStyle w:val="a9"/>
-        <w:ind w:left="720" w:hanging="720"/>
-        <w:jc w:val="both"/>
-      </w:pPr>
-      <w:r>
-        <w:rPr>
-          <w:rFonts w:ascii="新細明體" w:hAnsi="新細明體" w:eastAsia="新細明體"/>
-          <w:b w:val="0"/>
-          <w:sz w:val="24"/>
-        </w:rPr>
-        <w:t>備註：1. 機關異質採購最有利標作業須知業經本會97年9月22日工程企字第09700392350號函修正註：「機關異質採購最低標作業須知」、「機關異質採購最有利標作業須知」及「政府採購決標方式一覽表」業經本會105年7月29日工程企字第10500239540號函停止適用</w:t>
+        <w:ind w:left="960" w:hanging="960"/>
+        <w:jc w:val="both"/>
+      </w:pPr>
+      <w:r>
+        <w:rPr>
+          <w:rFonts w:ascii="新細明體" w:hAnsi="新細明體" w:eastAsia="新細明體"/>
+          <w:b w:val="0"/>
+          <w:sz w:val="24"/>
+        </w:rPr>
+        <w:t>備註：1. 機關異質採購最有利標作業須知業經本會97年9月22日工程企字第09700392350號函修正。</w:t>
+      </w:r>
+    </w:p>
+    <w:p>
+      <w:pPr>
+        <w:pStyle w:val="a9"/>
+        <w:ind w:left="960" w:hanging="240"/>
+        <w:jc w:val="both"/>
+      </w:pPr>
+      <w:r>
+        <w:rPr>
+          <w:rFonts w:ascii="新細明體" w:hAnsi="新細明體" w:eastAsia="新細明體"/>
+          <w:b w:val="0"/>
+          <w:sz w:val="24"/>
+        </w:rPr>
+        <w:t>2. 「機關異質採購最低標作業須知」、「機關異質採購最有利標作業須知」及「政府採購決標方式一覽表」業經本會105年7月29日工程企字第10500239540號函停止適用。</w:t>
       </w:r>
     </w:p>
     <w:p/>
@@ -2243,22 +2033,7 @@
           <w:b w:val="0"/>
           <w:sz w:val="24"/>
         </w:rPr>
-        <w:t>二、復依本法第22條第1項第9款規定：「機關辦理公告金額以上之採購，符合下列情形之一者，得採限制性招標：</w:t>
-      </w:r>
-    </w:p>
-    <w:p>
-      <w:pPr>
-        <w:pStyle w:val="a9"/>
-        <w:ind w:left="720" w:hanging="480"/>
-        <w:jc w:val="both"/>
-      </w:pPr>
-      <w:r>
-        <w:rPr>
-          <w:rFonts w:ascii="新細明體" w:hAnsi="新細明體" w:eastAsia="新細明體"/>
-          <w:b w:val="0"/>
-          <w:sz w:val="24"/>
-        </w:rPr>
-        <w:t>九、委託專業服務、技術服務或資訊服務，經公開客觀評選為優勝者。」另本會已依本法第22條第2項授權訂定「機關委託技術服務廠商評選及計費辦法」，其第22條規定採購評選委員會評選優勝廠商之評選作業，準用本法有關最有利標之評選規定。本會並多次通函各機關，建議辦理技術服務採購，依上開辦法規定辦理。</w:t>
+        <w:t>二、復依本法第22條第1項第9款規定：「機關辦理公告金額以上之採購，符合下列情形之一者，得採限制性招標：九、委託專業服務、技術服務或資訊服務，經公開客觀評選為優勝者。」另本會已依本法第22條第2項授權訂定「機關委託技術服務廠商評選及計費辦法」，其第22條規定採購評選委員會評選優勝廠商之評選作業，準用本法有關最有利標之評選規定。本會並多次通函各機關，建議辦理技術服務採購，依上開辦法規定辦理。</w:t>
       </w:r>
     </w:p>
     <w:p>
@@ -2349,7 +2124,7 @@
           <w:b w:val="0"/>
           <w:sz w:val="24"/>
         </w:rPr>
-        <w:t>備註：1. 法規委員會、企劃處網站（均含附件）註:「機關異質採購最低標作業須知」業經本會105年7月29日工程企字第10500239540號函停止適用。</w:t>
+        <w:t>備註：1. 「機關異質採購最低標作業須知」業經本會105年7月29日工程企字第10500239540號函停止適用。</w:t>
       </w:r>
     </w:p>
     <w:p>
@@ -2594,7 +2369,97 @@
           <w:b w:val="0"/>
           <w:sz w:val="24"/>
         </w:rPr>
-        <w:t>一、復貴組94年2月1日電傳信函。二、所詢問題1，關於「最有利標評選辦法」第14條第1款所稱「再行綜合評選一次」，係就同分、同商數或同序位者之既有投標文件內容及簡報結果，再行綜合評選一次，與政府採購法第56條第1項所定協商後再綜合評選之程序不同，故如招標文件規定廠商需簡報且無協商程序者，再行綜合評選時，無需通知該等廠商再行簡報一次。惟如招標文件規定允許採行協商措施者，廠商得於協商程序修改投標文件內容。三、所詢問題2，「最有利標評選辦法」第14條第1款已有規定，應抽籤決定之。四、所詢問題3，依上開條款有抽籤結果後，續適用政府採購法第56條第1項依機關首長或評選委員會過半數之決定評定最有利標或政府採購法第22條第1項第9款、第10款之優勝廠商。五、對政府採購法若有任何問題，請先至本會網站(http://www.pcc.gov.tw)\政府採購\政府採購法規\逐條釋例或相關解釋函查閱；如仍有疑義，請向服務單位採購主管或上級機關採購專責單位洽詢。受文單位：國立台灣大學醫學院附設醫院總務室採購組受文者：林炳坤君</w:t>
+        <w:t>一、復貴組94年2月1日電傳信函。</w:t>
+      </w:r>
+    </w:p>
+    <w:p>
+      <w:pPr>
+        <w:pStyle w:val="a9"/>
+        <w:ind w:left="720" w:hanging="480"/>
+        <w:jc w:val="both"/>
+      </w:pPr>
+      <w:r>
+        <w:rPr>
+          <w:rFonts w:ascii="新細明體" w:hAnsi="新細明體" w:eastAsia="新細明體"/>
+          <w:b w:val="0"/>
+          <w:sz w:val="24"/>
+        </w:rPr>
+        <w:t>二、所詢問題1，關於「最有利標評選辦法」第14條第1款所稱「再行綜合評選一次」，係就同分、同商數或同序位者之既有投標文件內容及簡報結果，再行綜合評選一次，與政府採購法第56條第1項所定協商後再綜合評選之程序不同，故如招標文件規定廠商需簡報且無協商程序者，再行綜合評選時，無需通知該等廠商再行簡報一次。惟如招標文件規定允許採行協商措施者，廠商得於協商程序修改投標文件內容。</w:t>
+      </w:r>
+    </w:p>
+    <w:p>
+      <w:pPr>
+        <w:pStyle w:val="a9"/>
+        <w:ind w:left="720" w:hanging="480"/>
+        <w:jc w:val="both"/>
+      </w:pPr>
+      <w:r>
+        <w:rPr>
+          <w:rFonts w:ascii="新細明體" w:hAnsi="新細明體" w:eastAsia="新細明體"/>
+          <w:b w:val="0"/>
+          <w:sz w:val="24"/>
+        </w:rPr>
+        <w:t>三、所詢問題2，「最有利標評選辦法」第14條第1款已有規定，應抽籤決定之。</w:t>
+      </w:r>
+    </w:p>
+    <w:p>
+      <w:pPr>
+        <w:pStyle w:val="a9"/>
+        <w:ind w:left="720" w:hanging="480"/>
+        <w:jc w:val="both"/>
+      </w:pPr>
+      <w:r>
+        <w:rPr>
+          <w:rFonts w:ascii="新細明體" w:hAnsi="新細明體" w:eastAsia="新細明體"/>
+          <w:b w:val="0"/>
+          <w:sz w:val="24"/>
+        </w:rPr>
+        <w:t>四、所詢問題3，依上開條款有抽籤結果後，續適用政府採購法第56條第1項依機關首長或評選委員會過半數之決定評定最有利標或政府採購法第22條第1項第9款、第10款之優勝廠商。</w:t>
+      </w:r>
+    </w:p>
+    <w:p>
+      <w:pPr>
+        <w:pStyle w:val="a9"/>
+        <w:ind w:left="720" w:hanging="480"/>
+        <w:jc w:val="both"/>
+      </w:pPr>
+      <w:r>
+        <w:rPr>
+          <w:rFonts w:ascii="新細明體" w:hAnsi="新細明體" w:eastAsia="新細明體"/>
+          <w:b w:val="0"/>
+          <w:sz w:val="24"/>
+        </w:rPr>
+        <w:t>五、對政府採購法若有任何問題，請先至本會網站(http://www.pcc.gov.tw)\政府採購\政府採購法規\逐條釋例或相關解釋函查閱；如仍有疑義，請向服務單位採購主管或上級機關採購專責單位洽詢。</w:t>
+      </w:r>
+    </w:p>
+    <w:p>
+      <w:pPr>
+        <w:pStyle w:val="a9"/>
+        <w:ind w:left="720" w:hanging="720"/>
+        <w:jc w:val="both"/>
+      </w:pPr>
+      <w:r>
+        <w:rPr>
+          <w:rFonts w:ascii="新細明體" w:hAnsi="新細明體" w:eastAsia="新細明體"/>
+          <w:b w:val="0"/>
+          <w:sz w:val="24"/>
+        </w:rPr>
+        <w:t>受文單位：國立台灣大學醫學院附設醫院總務室採購組</w:t>
+      </w:r>
+    </w:p>
+    <w:p>
+      <w:pPr>
+        <w:pStyle w:val="a9"/>
+        <w:ind w:left="720" w:hanging="720"/>
+        <w:jc w:val="both"/>
+      </w:pPr>
+      <w:r>
+        <w:rPr>
+          <w:rFonts w:ascii="新細明體" w:hAnsi="新細明體" w:eastAsia="新細明體"/>
+          <w:b w:val="0"/>
+          <w:sz w:val="24"/>
+        </w:rPr>
+        <w:t>受文者：林炳坤君</w:t>
       </w:r>
     </w:p>
     <w:p/>
@@ -2852,7 +2717,7 @@
           <w:b w:val="0"/>
           <w:sz w:val="24"/>
         </w:rPr>
-        <w:t>主旨：檢送&lt;a href="/gpletf/異質最低標須知-950523發文確定版.doc" target="_blank"「機關異質採購最低標作業須知」&lt;/a、&lt;a href="/gpletf/異質最有利標-950523發文確定版.doc" target="_blank"「機關異質採購最有利標作業須知」&lt;/a及&lt;a href="/gpletf/異質採購-政府採購決標方式一覽表-0523發文確定版.doc" target="_blank"「政府採購決標方式一覽表」&lt;/a，請查照並轉知所屬（轄）機關。</w:t>
+        <w:t>主旨：檢送「機關異質採購最低標作業須知」、「機關異質採購最有利標作業須知」及「政府採購決標方式一覽表」，請查照並轉知所屬（轄）機關。</w:t>
       </w:r>
     </w:p>
     <w:p>
@@ -2918,16 +2783,31 @@
     <w:p>
       <w:pPr>
         <w:pStyle w:val="a9"/>
-        <w:ind w:left="720" w:hanging="720"/>
-        <w:jc w:val="both"/>
-      </w:pPr>
-      <w:r>
-        <w:rPr>
-          <w:rFonts w:ascii="新細明體" w:hAnsi="新細明體" w:eastAsia="新細明體"/>
-          <w:b w:val="0"/>
-          <w:sz w:val="24"/>
-        </w:rPr>
-        <w:t>備註：1. 機關異質採購最有利標作業須知業經本會97年9月22日工程企字第09700392350號函修正註：「機關異質採購最低標作業須知」、「機關異質採購最有利標作業須知」及「政府採購決標方式一覽表」業經本會105年7月29日工程企字第10500239540號函停止適用</w:t>
+        <w:ind w:left="960" w:hanging="960"/>
+        <w:jc w:val="both"/>
+      </w:pPr>
+      <w:r>
+        <w:rPr>
+          <w:rFonts w:ascii="新細明體" w:hAnsi="新細明體" w:eastAsia="新細明體"/>
+          <w:b w:val="0"/>
+          <w:sz w:val="24"/>
+        </w:rPr>
+        <w:t>備註：1. 機關異質採購最有利標作業須知業經本會97年9月22日工程企字第09700392350號函修正。</w:t>
+      </w:r>
+    </w:p>
+    <w:p>
+      <w:pPr>
+        <w:pStyle w:val="a9"/>
+        <w:ind w:left="960" w:hanging="240"/>
+        <w:jc w:val="both"/>
+      </w:pPr>
+      <w:r>
+        <w:rPr>
+          <w:rFonts w:ascii="新細明體" w:hAnsi="新細明體" w:eastAsia="新細明體"/>
+          <w:b w:val="0"/>
+          <w:sz w:val="24"/>
+        </w:rPr>
+        <w:t>2. 「機關異質採購最低標作業須知」、「機關異質採購最有利標作業須知」及「政府採購決標方式一覽表」業經本會105年7月29日工程企字第10500239540號函停止適用。</w:t>
       </w:r>
     </w:p>
     <w:p/>
@@ -3033,7 +2913,7 @@
           <w:b w:val="0"/>
           <w:sz w:val="24"/>
         </w:rPr>
-        <w:t>備註：1. 本釋例說明二，業經工程會以97年9月16日工程企字第09700385670號函補充說明．[</w:t>
+        <w:t>備註：1. 本釋例說明二，業經工程會以97年9月16日工程企字第09700385670號函補充說明。</w:t>
       </w:r>
     </w:p>
     <w:p>
@@ -3048,7 +2928,7 @@
           <w:b w:val="0"/>
           <w:sz w:val="24"/>
         </w:rPr>
-        <w:t>2. ]：「機關異質採購最有利標作業須知」業經本會105年7月29日工程企字第10500239540號函停止適用</w:t>
+        <w:t>2. 「機關異質採購最有利標作業須知」業經本會105年7月29日工程企字第10500239540號函停止適用。</w:t>
       </w:r>
     </w:p>
     <w:p/>
@@ -3169,7 +3049,7 @@
           <w:b w:val="0"/>
           <w:sz w:val="24"/>
         </w:rPr>
-        <w:t>備註：1. 最有利標評選辦法部分條文業經本會於96年4月25日以工程企字第09600160900號令修正發布，本函說明一及二之(二)「第15條第3項」應配合修正為「第15條之1」．</w:t>
+        <w:t>備註：1. 最有利標評選辦法部分條文業經本會於96年4月25日以工程企字第09600160900號令修正發布，本函說明一及二之(二)「第15條第3項」應配合修正為「第15條之1」。</w:t>
       </w:r>
     </w:p>
     <w:p/>
@@ -4247,7 +4127,7 @@
           <w:b w:val="0"/>
           <w:sz w:val="24"/>
         </w:rPr>
-        <w:t>備註：1. 最有利標評選辦法部分條文業經本會於96年4月25日以工程企字第09600160900號令修正發布，本函說明一及二之(二)「第15條第3項」應配合修正為「第15條之1」．</w:t>
+        <w:t>備註：1. 最有利標評選辦法部分條文業經本會於96年4月25日以工程企字第09600160900號令修正發布，本函說明一及二之(二)「第15條第3項」應配合修正為「第15條之1」。</w:t>
       </w:r>
     </w:p>
     <w:p/>
@@ -4656,22 +4536,7 @@
           <w:b w:val="0"/>
           <w:sz w:val="24"/>
         </w:rPr>
-        <w:t>四、按採購人員倫理準則第7條第3款、第6款及第17款規定：「採購人員不得有下列行為：</w:t>
-      </w:r>
-    </w:p>
-    <w:p>
-      <w:pPr>
-        <w:pStyle w:val="a9"/>
-        <w:ind w:left="720" w:hanging="480"/>
-        <w:jc w:val="both"/>
-      </w:pPr>
-      <w:r>
-        <w:rPr>
-          <w:rFonts w:ascii="新細明體" w:hAnsi="新細明體" w:eastAsia="新細明體"/>
-          <w:b w:val="0"/>
-          <w:sz w:val="24"/>
-        </w:rPr>
-        <w:t>三、不依法令辦理採購。…六、未公正辦理採購。…十七、意圖為私人不正利益而高估預算、底價或應付契約價金，或為不當之規劃、設計、招標、審標、決標、履約管理或驗收。」採購人員如有操弄底價，為不當之決標行為者，機關應依同準則第12條及第13條規定處理；其觸犯刑事法令者，移送司法機關處理。</w:t>
+        <w:t>四、按採購人員倫理準則第7條第3款、第6款及第17款規定：「採購人員不得有下列行為：三、不依法令辦理採購。…六、未公正辦理採購。…十七、意圖為私人不正利益而高估預算、底價或應付契約價金，或為不當之規劃、設計、招標、審標、決標、履約管理或驗收。」採購人員如有操弄底價，為不當之決標行為者，機關應依同準則第12條及第13條規定處理；其觸犯刑事法令者，移送司法機關處理。</w:t>
       </w:r>
     </w:p>
     <w:p/>
@@ -4852,7 +4717,7 @@
           <w:b w:val="0"/>
           <w:sz w:val="24"/>
         </w:rPr>
-        <w:t>備註：1. ○ ○註：</w:t>
+        <w:t>備註：1. 說明二所載「機關委託資訊服務廠商評選及計費辦法」第12條第2款，業經本會105年7月1日工程企字第10500204360號令修正為第12條第1項第2款。</w:t>
       </w:r>
     </w:p>
     <w:p>
@@ -4867,22 +4732,7 @@
           <w:b w:val="0"/>
           <w:sz w:val="24"/>
         </w:rPr>
-        <w:t>2. 說明二所載「機關委託資訊服務廠商評選及計費辦法」第12條第2款，業經本會105年7月1日工程企字第10500204360號令修正為第12條第1項第2款。</w:t>
-      </w:r>
-    </w:p>
-    <w:p>
-      <w:pPr>
-        <w:pStyle w:val="a9"/>
-        <w:ind w:left="960" w:hanging="240"/>
-        <w:jc w:val="both"/>
-      </w:pPr>
-      <w:r>
-        <w:rPr>
-          <w:rFonts w:ascii="新細明體" w:hAnsi="新細明體" w:eastAsia="新細明體"/>
-          <w:b w:val="0"/>
-          <w:sz w:val="24"/>
-        </w:rPr>
-        <w:t>3. 說明三之(二) 所載「機關異質採購最有利標作業須知」業經本會105年7月29日工程企字第10500239540號函停止適用。</w:t>
+        <w:t>2. 說明三之(二) 所載「機關異質採購最有利標作業須知」業經本會105年7月29日工程企字第10500239540號函停止適用。</w:t>
       </w:r>
     </w:p>
     <w:p/>
@@ -4988,22 +4838,7 @@
           <w:b w:val="0"/>
           <w:sz w:val="24"/>
         </w:rPr>
-        <w:t>（一）審議規則第14條第3款規定：「本委員會委員有下列情形之一者，應即辭職或予以解聘：</w:t>
-      </w:r>
-    </w:p>
-    <w:p>
-      <w:pPr>
-        <w:pStyle w:val="a9"/>
-        <w:ind w:left="720" w:hanging="480"/>
-        <w:jc w:val="both"/>
-      </w:pPr>
-      <w:r>
-        <w:rPr>
-          <w:rFonts w:ascii="新細明體" w:hAnsi="新細明體" w:eastAsia="新細明體"/>
-          <w:b w:val="0"/>
-          <w:sz w:val="24"/>
-        </w:rPr>
-        <w:t>三、委員認為本人或機關認其有不能公正執行職務之虞。」關於來函所述「透過評選委員書面表示不接受未來廠商講師邀約之方式」或「其餘折衷方式」乙節，如貴會得確認該委員嗣後不擔任受評廠商之履約工作成員或協助履約（包括講師邀約），且無涉上開規定所稱「不能公正執行職務之虞」，賡續由上開委員辦理評選程序，尚無不可。</w:t>
+        <w:t>（一）審議規則第14條第3款規定：「本委員會委員有下列情形之一者，應即辭職或予以解聘：三、委員認為本人或機關認其有不能公正執行職務之虞。」關於來函所述「透過評選委員書面表示不接受未來廠商講師邀約之方式」或「其餘折衷方式」乙節，如貴會得確認該委員嗣後不擔任受評廠商之履約工作成員或協助履約（包括講師邀約），且無涉上開規定所稱「不能公正執行職務之虞」，賡續由上開委員辦理評選程序，尚無不可。</w:t>
       </w:r>
     </w:p>
     <w:p>
@@ -5109,37 +4944,7 @@
           <w:b w:val="0"/>
           <w:sz w:val="24"/>
         </w:rPr>
-        <w:t>二、查政府採購法（下稱採購法）第47條第1項規定：「機關辦理下列採購，得不訂底價。但應於招標文件內敘明理由及決標條件與原則︰一、訂定底價確有困難之特殊或複雜案件。</w:t>
-      </w:r>
-    </w:p>
-    <w:p>
-      <w:pPr>
-        <w:pStyle w:val="a9"/>
-        <w:ind w:left="720" w:hanging="480"/>
-        <w:jc w:val="both"/>
-      </w:pPr>
-      <w:r>
-        <w:rPr>
-          <w:rFonts w:ascii="新細明體" w:hAnsi="新細明體" w:eastAsia="新細明體"/>
-          <w:b w:val="0"/>
-          <w:sz w:val="24"/>
-        </w:rPr>
-        <w:t>二、以最有利標決標之採購。</w:t>
-      </w:r>
-    </w:p>
-    <w:p>
-      <w:pPr>
-        <w:pStyle w:val="a9"/>
-        <w:ind w:left="720" w:hanging="480"/>
-        <w:jc w:val="both"/>
-      </w:pPr>
-      <w:r>
-        <w:rPr>
-          <w:rFonts w:ascii="新細明體" w:hAnsi="新細明體" w:eastAsia="新細明體"/>
-          <w:b w:val="0"/>
-          <w:sz w:val="24"/>
-        </w:rPr>
-        <w:t>三、小額採購。」查其立法理由略以：「一、機關辦理採購因範圍廣泛，內容複雜，有因無前例可循或同時有多種不同規格或性能之工法產品可參與競標，致無法訂出客觀正確之底價者；有依其性質，不須訂定底價者，亦有因金額過小，無訂定底價之必要者。......」合先敘明。</w:t>
+        <w:t>二、查政府採購法（下稱採購法）第47條第1項規定：「機關辦理下列採購，得不訂底價。但應於招標文件內敘明理由及決標條件與原則︰一、訂定底價確有困難之特殊或複雜案件。二、以最有利標決標之採購。三、小額採購。」查其立法理由略以：「一、機關辦理採購因範圍廣泛，內容複雜，有因無前例可循或同時有多種不同規格或性能之工法產品可參與競標，致無法訂出客觀正確之底價者；有依其性質，不須訂定底價者，亦有因金額過小，無訂定底價之必要者。......」合先敘明。</w:t>
       </w:r>
     </w:p>
     <w:p>
@@ -5328,31 +5133,16 @@
     <w:p>
       <w:pPr>
         <w:pStyle w:val="a9"/>
-        <w:ind w:left="960" w:hanging="960"/>
-        <w:jc w:val="both"/>
-      </w:pPr>
-      <w:r>
-        <w:rPr>
-          <w:rFonts w:ascii="新細明體" w:hAnsi="新細明體" w:eastAsia="新細明體"/>
-          <w:b w:val="0"/>
-          <w:sz w:val="24"/>
-        </w:rPr>
-        <w:t>備註：1. 「註」：本函內容於本會九十一年五月三日（九一）工程企字第九一〇一七三九四號令修正公布「中央機關未達公告金額採購招標辦法」第四條第一項已有規定。</w:t>
-      </w:r>
-    </w:p>
-    <w:p>
-      <w:pPr>
-        <w:pStyle w:val="a9"/>
-        <w:ind w:left="960" w:hanging="240"/>
-        <w:jc w:val="both"/>
-      </w:pPr>
-      <w:r>
-        <w:rPr>
-          <w:rFonts w:ascii="新細明體" w:hAnsi="新細明體" w:eastAsia="新細明體"/>
-          <w:b w:val="0"/>
-          <w:sz w:val="24"/>
-        </w:rPr>
-        <w:t>2. 「註」：本函內容於本會九十一年五月三日（九一）工程企字第九一○一七三九四號令修正公布「中央機關未達公告金額採購招標辦法」第四條第一項已有規定。</w:t>
+        <w:ind w:left="720" w:hanging="720"/>
+        <w:jc w:val="both"/>
+      </w:pPr>
+      <w:r>
+        <w:rPr>
+          <w:rFonts w:ascii="新細明體" w:hAnsi="新細明體" w:eastAsia="新細明體"/>
+          <w:b w:val="0"/>
+          <w:sz w:val="24"/>
+        </w:rPr>
+        <w:t>備註：1. 本函內容於本會九十一年五月三日（九一）工程企字第九一〇一七三九四號令修正公布「中央機關未達公告金額採購招標辦法」第四條第一項已有規定。</w:t>
       </w:r>
     </w:p>
     <w:p>
@@ -6066,7 +5856,22 @@
           <w:b w:val="0"/>
           <w:sz w:val="24"/>
         </w:rPr>
-        <w:t>一、復貴部98年5月11日台審部五字第0980001726號函。二、目前系統介接處理情形說明如下：</w:t>
+        <w:t>一、復貴部98年5月11日台審部五字第0980001726號函。</w:t>
+      </w:r>
+    </w:p>
+    <w:p>
+      <w:pPr>
+        <w:pStyle w:val="a9"/>
+        <w:ind w:left="720" w:hanging="480"/>
+        <w:jc w:val="both"/>
+      </w:pPr>
+      <w:r>
+        <w:rPr>
+          <w:rFonts w:ascii="新細明體" w:hAnsi="新細明體" w:eastAsia="新細明體"/>
+          <w:b w:val="0"/>
+          <w:sz w:val="24"/>
+        </w:rPr>
+        <w:t>二、目前系統介接處理情形說明如下：</w:t>
       </w:r>
     </w:p>
     <w:p>
@@ -8112,22 +7917,7 @@
           <w:b w:val="0"/>
           <w:sz w:val="24"/>
         </w:rPr>
-        <w:t>二、政府採購法（以下簡稱採購法）第3條規定：「政府機關、公立學校、公營事業 (以下簡稱機關) 辦理採購，依本法之規定；本法未規定者，適用其他法律之規定。」資恐防制法第7條第1項第3款規定：「對於依第四條第一項或第五條第一項指定制裁之個人、法人或團體，除前條第一項所列措施外，不得為下列行為：</w:t>
-      </w:r>
-    </w:p>
-    <w:p>
-      <w:pPr>
-        <w:pStyle w:val="a9"/>
-        <w:ind w:left="720" w:hanging="480"/>
-        <w:jc w:val="both"/>
-      </w:pPr>
-      <w:r>
-        <w:rPr>
-          <w:rFonts w:ascii="新細明體" w:hAnsi="新細明體" w:eastAsia="新細明體"/>
-          <w:b w:val="0"/>
-          <w:sz w:val="24"/>
-        </w:rPr>
-        <w:t>三、為其收集或提供財物或財產上利益。」</w:t>
+        <w:t>二、政府採購法（以下簡稱採購法）第3條規定：「政府機關、公立學校、公營事業 (以下簡稱機關) 辦理採購，依本法之規定；本法未規定者，適用其他法律之規定。」資恐防制法第7條第1項第3款規定：「對於依第四條第一項或第五條第一項指定制裁之個人、法人或團體，除前條第一項所列措施外，不得為下列行為：三、為其收集或提供財物或財產上利益。」</w:t>
       </w:r>
     </w:p>
     <w:p>
@@ -9066,22 +8856,7 @@
           <w:b w:val="0"/>
           <w:sz w:val="24"/>
         </w:rPr>
-        <w:t>六、來函說明六所詢疑義，評選結果序位第1廠商，如未能經評選委員會過半數決定為最有利標廠商，其會議紀錄應記載事項，依最有利標評選辦法第23條規定須載明「評選過程紀要」及「各投標廠商評選結果」，理當包括該廠商之評選結果無法依評選委員會過半數之決定評定為最有利標之相關內容。另審議規則第6條之1第2項第5款亦規定：「機關於委員評選後，應彙整製作總表，載明下列事項，由參與評選全體委員簽名或蓋章。其内容有修正者，應經修正人員簽名或蓋章：</w:t>
-      </w:r>
-    </w:p>
-    <w:p>
-      <w:pPr>
-        <w:pStyle w:val="a9"/>
-        <w:ind w:left="720" w:hanging="480"/>
-        <w:jc w:val="both"/>
-      </w:pPr>
-      <w:r>
-        <w:rPr>
-          <w:rFonts w:ascii="新細明體" w:hAnsi="新細明體" w:eastAsia="新細明體"/>
-          <w:b w:val="0"/>
-          <w:sz w:val="24"/>
-        </w:rPr>
-        <w:t>五、全部出席委員對各受評廠商之總評選結果。」</w:t>
+        <w:t>六、來函說明六所詢疑義，評選結果序位第1廠商，如未能經評選委員會過半數決定為最有利標廠商，其會議紀錄應記載事項，依最有利標評選辦法第23條規定須載明「評選過程紀要」及「各投標廠商評選結果」，理當包括該廠商之評選結果無法依評選委員會過半數之決定評定為最有利標之相關內容。另審議規則第6條之1第2項第5款亦規定：「機關於委員評選後，應彙整製作總表，載明下列事項，由參與評選全體委員簽名或蓋章。其内容有修正者，應經修正人員簽名或蓋章：五、全部出席委員對各受評廠商之總評選結果。」</w:t>
       </w:r>
     </w:p>
     <w:p/>
@@ -9552,21 +9327,6 @@
           <w:b w:val="0"/>
           <w:sz w:val="24"/>
         </w:rPr>
-        <w:t>聯絡人：本會技術處游技正 (02)87897683</w:t>
-      </w:r>
-    </w:p>
-    <w:p>
-      <w:pPr>
-        <w:pStyle w:val="a9"/>
-        <w:ind w:left="720" w:hanging="720"/>
-        <w:jc w:val="both"/>
-      </w:pPr>
-      <w:r>
-        <w:rPr>
-          <w:rFonts w:ascii="新細明體" w:hAnsi="新細明體" w:eastAsia="新細明體"/>
-          <w:b w:val="0"/>
-          <w:sz w:val="24"/>
-        </w:rPr>
         <w:t>主旨：本會建置新版工程價格電子檔上傳專屬平台將於106年12月1日上線運作，相關事宜詳如說明，請查照並轉知所屬。</w:t>
       </w:r>
     </w:p>
@@ -9658,7 +9418,97 @@
           <w:b w:val="0"/>
           <w:sz w:val="24"/>
         </w:rPr>
-        <w:t>主旨：為提升採購評選委員參與政府採購案件之評選品質，政府電子採購網自108年11月1日起，啟用採購評選委員滿意度評量功能，請查照並轉知所屬機關。說明：一、個案採購評選委員係由各招標機關遴聘(派)，爰於政府電子採購網建置評量功能，由招標機關對於實際有出席評選之委員，就其專業、公正辦理評選之表現，予以滿意、尚可或不滿意之評量。二、本功能適用於採最有利標與準用最有利標評選優勝廠商而成立採購評選委員會之案件，及採政府採購法施行細則第64條之2所定評分及格最低標而成立審查委員會之案件，且決標日期為108年11月1日以後者。三、招標機關對於出席評選之委員登載上述滿意度，政府電子採購網之路徑為https://web.pcc.gov.tw/政府採購/決標管理/新增決標公告；勾選「不滿意」者，須登載不滿意理由。四、各機關登載之滿意度資料，本會將於累積至一定程度後，開放供各機關作業參考。五、有關本功能之系統操作問題，請至政府電子採購網(首頁/下載專區 / 系統使用手冊)下載系統使用手冊。如有其他系統操作問題，請逕洽政府電子採購網客服專線電話：0800-080512。</w:t>
+        <w:t>主旨：為提升採購評選委員參與政府採購案件之評選品質，政府電子採購網自108年11月1日起，啟用採購評選委員滿意度評量功能，請查照並轉知所屬機關。</w:t>
+      </w:r>
+    </w:p>
+    <w:p>
+      <w:pPr>
+        <w:pStyle w:val="a9"/>
+        <w:ind w:left="720" w:hanging="720"/>
+        <w:jc w:val="both"/>
+      </w:pPr>
+      <w:r>
+        <w:rPr>
+          <w:rFonts w:ascii="新細明體" w:hAnsi="新細明體" w:eastAsia="新細明體"/>
+          <w:b w:val="0"/>
+          <w:sz w:val="24"/>
+        </w:rPr>
+        <w:t>說明：</w:t>
+      </w:r>
+    </w:p>
+    <w:p>
+      <w:pPr>
+        <w:pStyle w:val="a9"/>
+        <w:ind w:left="720" w:hanging="480"/>
+        <w:jc w:val="both"/>
+      </w:pPr>
+      <w:r>
+        <w:rPr>
+          <w:rFonts w:ascii="新細明體" w:hAnsi="新細明體" w:eastAsia="新細明體"/>
+          <w:b w:val="0"/>
+          <w:sz w:val="24"/>
+        </w:rPr>
+        <w:t>一、個案採購評選委員係由各招標機關遴聘(派)，爰於政府電子採購網建置評量功能，由招標機關對於實際有出席評選之委員，就其專業、公正辦理評選之表現，予以滿意、尚可或不滿意之評量。</w:t>
+      </w:r>
+    </w:p>
+    <w:p>
+      <w:pPr>
+        <w:pStyle w:val="a9"/>
+        <w:ind w:left="720" w:hanging="480"/>
+        <w:jc w:val="both"/>
+      </w:pPr>
+      <w:r>
+        <w:rPr>
+          <w:rFonts w:ascii="新細明體" w:hAnsi="新細明體" w:eastAsia="新細明體"/>
+          <w:b w:val="0"/>
+          <w:sz w:val="24"/>
+        </w:rPr>
+        <w:t>二、本功能適用於採最有利標與準用最有利標評選優勝廠商而成立採購評選委員會之案件，及採政府採購法施行細則第64條之2所定評分及格最低標而成立審查委員會之案件，且決標日期為108年11月1日以後者。</w:t>
+      </w:r>
+    </w:p>
+    <w:p>
+      <w:pPr>
+        <w:pStyle w:val="a9"/>
+        <w:ind w:left="720" w:hanging="480"/>
+        <w:jc w:val="both"/>
+      </w:pPr>
+      <w:r>
+        <w:rPr>
+          <w:rFonts w:ascii="新細明體" w:hAnsi="新細明體" w:eastAsia="新細明體"/>
+          <w:b w:val="0"/>
+          <w:sz w:val="24"/>
+        </w:rPr>
+        <w:t>三、招標機關對於出席評選之委員登載上述滿意度，政府電子採購網之路徑為https://web.pcc.gov.tw/政府採購/決標管理/新增決標公告；勾選「不滿意」者，須登載不滿意理由。</w:t>
+      </w:r>
+    </w:p>
+    <w:p>
+      <w:pPr>
+        <w:pStyle w:val="a9"/>
+        <w:ind w:left="720" w:hanging="480"/>
+        <w:jc w:val="both"/>
+      </w:pPr>
+      <w:r>
+        <w:rPr>
+          <w:rFonts w:ascii="新細明體" w:hAnsi="新細明體" w:eastAsia="新細明體"/>
+          <w:b w:val="0"/>
+          <w:sz w:val="24"/>
+        </w:rPr>
+        <w:t>四、各機關登載之滿意度資料，本會將於累積至一定程度後，開放供各機關作業參考。</w:t>
+      </w:r>
+    </w:p>
+    <w:p>
+      <w:pPr>
+        <w:pStyle w:val="a9"/>
+        <w:ind w:left="720" w:hanging="480"/>
+        <w:jc w:val="both"/>
+      </w:pPr>
+      <w:r>
+        <w:rPr>
+          <w:rFonts w:ascii="新細明體" w:hAnsi="新細明體" w:eastAsia="新細明體"/>
+          <w:b w:val="0"/>
+          <w:sz w:val="24"/>
+        </w:rPr>
+        <w:t>五、有關本功能之系統操作問題，請至政府電子採購網(首頁/下載專區/系統使用手冊)下載系統使用手冊。如有其他系統操作問題，請逕洽政府電子採購網客服專線電話：0800-080512。</w:t>
       </w:r>
     </w:p>
     <w:sectPr>

</xml_diff>